<commit_message>
wip: merge in budgetNumber persistence, no paid/pending in documents, maintenanceDueDay, noticeDays/cureDays=30, and updated Clause 7 (source code + legal basis) from the parallel session's work, layered on top of the per-client fields
</commit_message>
<xml_diff>
--- a/public/templates/contrato.docx
+++ b/public/templates/contrato.docx
@@ -979,35 +979,35 @@
           <w:sz w:val="22"/>
           <w:szCs w:val="22"/>
         </w:rPr>
-        <w:t xml:space="preserve">Após a confirmação do pagamento final, o(a) CONTRATANTE passa a ser o titular do conteúdo e da configuração visual desenvolvidos especificamente para o seu projeto, podendo utilizá-los livremente para os fins do seu negócio.</w:t>
-      </w:r>
-    </w:p>
-    <w:p>
-      <w:pPr>
-        <w:spacing w:after="160"/>
-        <w:jc w:val="both"/>
-      </w:pPr>
-      <w:r>
-        <w:rPr>
-          <w:rFonts w:ascii="Calibri" w:cs="Calibri" w:eastAsia="Calibri" w:hAnsi="Calibri"/>
-          <w:sz w:val="22"/>
-          <w:szCs w:val="22"/>
-        </w:rPr>
-        <w:t xml:space="preserve">Ficam excluídos desta cessão: bibliotecas, componentes e frameworks de código aberto (open source) utilizados no desenvolvimento, que permanecem regidos por suas próprias licenças; e elementos de marca do(a) CONTRATADO(A) (ex.: menção "desenvolvido por ēloSites"), quando presentes no site.</w:t>
-      </w:r>
-    </w:p>
-    <w:p>
-      <w:pPr>
-        <w:spacing w:after="160"/>
-        <w:jc w:val="both"/>
-      </w:pPr>
-      <w:r>
-        <w:rPr>
-          <w:rFonts w:ascii="Calibri" w:cs="Calibri" w:eastAsia="Calibri" w:hAnsi="Calibri"/>
-          <w:sz w:val="22"/>
-          <w:szCs w:val="22"/>
-        </w:rPr>
-        <w:t xml:space="preserve">Domínio e hospedagem são serviços de terceiros, contratados e pagos diretamente pelo(a) CONTRATANTE junto à empresa/provedor de sua preferência. A ēloSites não comercializa, revende ou fornece esses serviços e não recebe comissão por sua contratação. A transferência dos materiais técnicos do projeto — código-fonte, repositório, informações de implantação e configuração efetivamente entregues — é tratada separadamente da cessão de direitos sobre o conteúdo e ocorre apenas quando expressamente solicitada pelo(a) CONTRATANTE, mediante checklist de transferência específico. A configuração e conexão técnica de domínio e hospedagem, quando previstas no escopo aprovado, fazem parte dos entregáveis contratados, sem cobrança adicional específica; migrações ou configurações fora do escopo aprovado poderão ser objeto de orçamento separado.</w:t>
+        <w:t xml:space="preserve">Após a confirmação do pagamento final, o(a) CONTRATANTE passa a ser o titular do conteúdo, da configuração visual e do código-fonte desenvolvidos especificamente para o seu projeto, com a cessão dos direitos patrimoniais de uso, modificação e reprodução sobre eles (Lei nº 9.610/1998, art. 49, e Lei nº 9.609/1998), podendo utilizá-los, modificá-los e repassá-los a terceiros livremente para os fins do seu negócio.</w:t>
+      </w:r>
+    </w:p>
+    <w:p>
+      <w:pPr>
+        <w:spacing w:after="160"/>
+        <w:jc w:val="both"/>
+      </w:pPr>
+      <w:r>
+        <w:rPr>
+          <w:rFonts w:ascii="Calibri" w:cs="Calibri" w:eastAsia="Calibri" w:hAnsi="Calibri"/>
+          <w:sz w:val="22"/>
+          <w:szCs w:val="22"/>
+        </w:rPr>
+        <w:t xml:space="preserve">Ficam excluídos desta cessão: bibliotecas, componentes e frameworks de código aberto (open source) utilizados no desenvolvimento, que permanecem regidos por suas próprias licenças; elementos de marca do(a) CONTRATADO(A) (ex.: menção "desenvolvido por ēloSites"), quando presentes no site; e ferramentas, bases e componentes reutilizáveis do(a) CONTRATADO(A), sobre os quais é concedida ao(à) CONTRATANTE licença de uso não exclusiva, por prazo indeterminado, restrita ao site entregue.</w:t>
+      </w:r>
+    </w:p>
+    <w:p>
+      <w:pPr>
+        <w:spacing w:after="160"/>
+        <w:jc w:val="both"/>
+      </w:pPr>
+      <w:r>
+        <w:rPr>
+          <w:rFonts w:ascii="Calibri" w:cs="Calibri" w:eastAsia="Calibri" w:hAnsi="Calibri"/>
+          <w:sz w:val="22"/>
+          <w:szCs w:val="22"/>
+        </w:rPr>
+        <w:t xml:space="preserve">Domínio e hospedagem são serviços de terceiros, contratados e pagos diretamente pelo(a) CONTRATANTE junto à empresa/provedor de sua preferência. A ēloSites não comercializa, revende ou fornece esses serviços e não recebe comissão por sua contratação. A transferência dos materiais técnicos do projeto — código-fonte, repositório, informações de implantação e configuração efetivamente entregues — é tratada separadamente da cessão de direitos prevista acima e ocorre apenas quando expressamente solicitada pelo(a) CONTRATANTE, mediante checklist de transferência específico. A configuração e conexão técnica de domínio e hospedagem, quando previstas no escopo aprovado, fazem parte dos entregáveis contratados, sem cobrança adicional específica; migrações ou configurações fora do escopo aprovado poderão ser objeto de orçamento separado.</w:t>
       </w:r>
     </w:p>
     <w:p>

</xml_diff>